<commit_message>
docs: update answer.md, answer.docx, and answer.pdf with Windows symlink troubleshooting for Task 4
</commit_message>
<xml_diff>
--- a/answer.docx
+++ b/answer.docx
@@ -4,7 +4,6 @@
   <w:body>
     <w:p>
       <w:pPr>
-        <w:spacing w:before="0" w:after="40"/>
         <w:jc w:val="center"/>
       </w:pPr>
       <w:r>
@@ -61,9 +60,6 @@
             </w:tcBorders>
           </w:tcPr>
           <w:p>
-            <w:pPr>
-              <w:spacing w:before="40" w:after="40"/>
-            </w:pPr>
             <w:r>
               <w:rPr>
                 <w:rFonts w:ascii="Kantumruy Pro" w:hAnsi="Kantumruy Pro"/>
@@ -93,9 +89,6 @@
             </w:tcBorders>
           </w:tcPr>
           <w:p>
-            <w:pPr>
-              <w:spacing w:before="40" w:after="40"/>
-            </w:pPr>
             <w:r>
               <w:rPr>
                 <w:rFonts w:ascii="Kantumruy Pro" w:hAnsi="Kantumruy Pro"/>
@@ -127,9 +120,6 @@
             </w:tcBorders>
           </w:tcPr>
           <w:p>
-            <w:pPr>
-              <w:spacing w:before="40" w:after="40"/>
-            </w:pPr>
             <w:r>
               <w:rPr>
                 <w:rFonts w:ascii="Kantumruy Pro" w:hAnsi="Kantumruy Pro"/>
@@ -159,9 +149,6 @@
             </w:tcBorders>
           </w:tcPr>
           <w:p>
-            <w:pPr>
-              <w:spacing w:before="40" w:after="40"/>
-            </w:pPr>
             <w:r>
               <w:rPr>
                 <w:rFonts w:ascii="Kantumruy Pro" w:hAnsi="Kantumruy Pro"/>
@@ -193,9 +180,6 @@
             </w:tcBorders>
           </w:tcPr>
           <w:p>
-            <w:pPr>
-              <w:spacing w:before="40" w:after="40"/>
-            </w:pPr>
             <w:r>
               <w:rPr>
                 <w:rFonts w:ascii="Kantumruy Pro" w:hAnsi="Kantumruy Pro"/>
@@ -225,9 +209,6 @@
             </w:tcBorders>
           </w:tcPr>
           <w:p>
-            <w:pPr>
-              <w:spacing w:before="40" w:after="40"/>
-            </w:pPr>
             <w:r>
               <w:rPr>
                 <w:rFonts w:ascii="Kantumruy Pro" w:hAnsi="Kantumruy Pro"/>
@@ -259,9 +240,6 @@
             </w:tcBorders>
           </w:tcPr>
           <w:p>
-            <w:pPr>
-              <w:spacing w:before="40" w:after="40"/>
-            </w:pPr>
             <w:r>
               <w:rPr>
                 <w:rFonts w:ascii="Kantumruy Pro" w:hAnsi="Kantumruy Pro"/>
@@ -291,9 +269,6 @@
             </w:tcBorders>
           </w:tcPr>
           <w:p>
-            <w:pPr>
-              <w:spacing w:before="40" w:after="40"/>
-            </w:pPr>
             <w:r>
               <w:rPr>
                 <w:rFonts w:ascii="Kantumruy Pro" w:hAnsi="Kantumruy Pro"/>
@@ -325,9 +300,6 @@
             </w:tcBorders>
           </w:tcPr>
           <w:p>
-            <w:pPr>
-              <w:spacing w:before="40" w:after="40"/>
-            </w:pPr>
             <w:r>
               <w:rPr>
                 <w:rFonts w:ascii="Kantumruy Pro" w:hAnsi="Kantumruy Pro"/>
@@ -357,9 +329,6 @@
             </w:tcBorders>
           </w:tcPr>
           <w:p>
-            <w:pPr>
-              <w:spacing w:before="40" w:after="40"/>
-            </w:pPr>
             <w:r>
               <w:rPr>
                 <w:rFonts w:ascii="Plus Jakarta Sans" w:hAnsi="Plus Jakarta Sans"/>
@@ -391,9 +360,6 @@
             </w:tcBorders>
           </w:tcPr>
           <w:p>
-            <w:pPr>
-              <w:spacing w:before="40" w:after="40"/>
-            </w:pPr>
             <w:r>
               <w:rPr>
                 <w:rFonts w:ascii="Kantumruy Pro" w:hAnsi="Kantumruy Pro"/>
@@ -423,9 +389,6 @@
             </w:tcBorders>
           </w:tcPr>
           <w:p>
-            <w:pPr>
-              <w:spacing w:before="40" w:after="40"/>
-            </w:pPr>
             <w:r>
               <w:rPr>
                 <w:rFonts w:ascii="Plus Jakarta Sans" w:hAnsi="Plus Jakarta Sans"/>
@@ -457,9 +420,6 @@
             </w:tcBorders>
           </w:tcPr>
           <w:p>
-            <w:pPr>
-              <w:spacing w:before="40" w:after="40"/>
-            </w:pPr>
             <w:r>
               <w:rPr>
                 <w:rFonts w:ascii="Kantumruy Pro" w:hAnsi="Kantumruy Pro"/>
@@ -489,9 +449,6 @@
             </w:tcBorders>
           </w:tcPr>
           <w:p>
-            <w:pPr>
-              <w:spacing w:before="40" w:after="40"/>
-            </w:pPr>
             <w:r>
               <w:rPr>
                 <w:rFonts w:ascii="Kantumruy Pro" w:hAnsi="Kantumruy Pro"/>
@@ -1815,7 +1772,7 @@
           <w:color w:val="1E293B"/>
           <w:sz w:val="21"/>
         </w:rPr>
-        <w:t>ខ្ញុំបានចូលទៅកាន់ http://localhost:8034 រួចធ្វើការ Refresh ចំនួនលើសពី ១០ ដង (ជាក់ស្តែងគឺ ១៣ ដង) ដើម្បីបង្កើត HTTP GET Requests ជាក់ស្តែងកត់ត្រាចូលទៅក្នុង Web Server Access Log។</w:t>
+        <w:t>ខ្ញុំបានចូលទៅកាន់ http://localhost:8034 រួចធ្វើការ Refresh ចំនួនលើសពី ១០ ដង (ជាក់ស្តែងគឺ ១៥ ដង) ដើម្បីបង្កើត HTTP Requests ជាក់ស្តែងកត់ត្រាចូលទៅក្នុង Web Server Access Log។</w:t>
       </w:r>
     </w:p>
     <w:p>
@@ -1926,7 +1883,7 @@
                 <w:color w:val="0284C7"/>
                 <w:sz w:val="21"/>
               </w:rPr>
-              <w:t>ចំណាំបច្ចេកទេសកម្រិតខ្ពស់ (Expert Technical Note):</w:t>
+              <w:t>ការវិភាគបច្ចេកទេស និងការដោះស្រាយបញ្ហាលើ Windows (Deep Troubleshooting Experience):</w:t>
               <w:br/>
             </w:r>
             <w:r>
@@ -1936,7 +1893,21 @@
                 <w:color w:val="0F172A"/>
                 <w:sz w:val="20"/>
               </w:rPr>
-              <w:t>នៅក្នុង Official Docker Image nginx:alpine ឯកសារ /var/log/nginx/access.log ត្រូវបាន Docker ធ្វើ Symlink ទៅកាន់ /dev/stdout ដើម្បីឱ្យ Docker Daemon ចាប់ Log តាម Standard Output។ ដូច្នេះយើងក៏អាចប្រើប្រាស់ពាក្យបញ្ជាផ្លូវការរបស់ Docker Subsystem បានផងដែរ៖</w:t>
+              <w:t>នៅពេលដំណើរការពាក្យបញ្ជា docker cp លើ Windows (Non-Administrator Terminal) យើងនឹងជួបសារព្រមាន៖</w:t>
+              <w:br/>
+              <w:t>symlinkat /dev/stdout host_access.log: A required privilege is not held by the client.</w:t>
+              <w:br/>
+              <w:br/>
+              <w:t>មូលហេតុបច្ចេកទេស (Root Cause Analysis):</w:t>
+              <w:br/>
+              <w:t>1. នៅក្នុង Base Image ផ្លូវការ nginx:alpine ឯកសារ /var/log/nginx/access.log មិនមែនជា File ធម្មតាទេ វាជា Linux Symbolic Link (Symlink) ដែលចង្អុលទៅកាន់ /dev/stdout។</w:t>
+              <w:br/>
+              <w:t>2. នៅលើប្រព័ន្ធប្រតិបត្តិការ Windows ការបង្កើត Symbolic Link តម្រូវឱ្យមានសិទ្ធិកម្រិត Administrator។ ប្រសិនបើដំណើរការ Terminal ធម្មតា Windows នឹងបដិសេធមិនឱ្យបង្កើត Symlink ឡើយ។</w:t>
+              <w:br/>
+              <w:br/>
+              <w:t>ដំណោះស្រាយដ៏ត្រឹមត្រូវ និងមានប្រសិទ្ធភាពបំផុត (The Production-Ready Solution):</w:t>
+              <w:br/>
+              <w:t>ដើម្បីទាញយកអត្ថបទ Log ពិតប្រាកដចេញពី Standard Output Stream ដោយមិនបាច់ពឹងផ្អែកលើ Windows Symlink Permissions យើងប្រើប្រាស់ពាក្យបញ្ជាផ្លូវការរបស់ Docker Logging Subsystem៖</w:t>
               <w:br/>
               <w:t>docker logs panha-bio-site &gt; host_access.log</w:t>
             </w:r>
@@ -1974,7 +1945,7 @@
           <w:color w:val="1E293B"/>
           <w:sz w:val="21"/>
         </w:rPr>
-        <w:t>ឯកសារ host_access.log ត្រូវបានបង្កើតឡើង និងទាញយកដោយជោគជ័យនៅក្នុង Folder គម្រោង ដែលមានកំណត់ត្រាលើសពី ១០ ដង ជាមួយ Port 8034៖</w:t>
+        <w:t>ឯកសារ host_access.log ត្រូវបានបង្កើតឡើង និងទាញយកដោយជោគជ័យនៅក្នុង Folder គម្រោង ដែលមានកំណត់ត្រាលើសពី ១០ ដង (ជាក់ស្តែងគឺ ១៥ ដង) ជាមួយ Port 8034៖</w:t>
       </w:r>
     </w:p>
     <w:tbl>
@@ -2008,31 +1979,35 @@
                 <w:color w:val="0F172A"/>
                 <w:sz w:val="19"/>
               </w:rPr>
-              <w:t>172.17.0.1 - - [25/Oct/2026:08:38:38 +0000] "GET / HTTP/1.1" 200 7903 "-" "Mozilla/5.0 (Windows NT 10.0; Win64; x64) AppleWebKit/537.36 (KHTML, like Gecko) Chrome/155.0.0.0 Safari/537.36" "-"</w:t>
+              <w:t>172.17.0.1 - - [25/Oct/2026:09:19:32 +0000] "GET / HTTP/1.1" 304 0 "-" "Mozilla/5.0 (Windows NT 10.0; Win64; x64) AppleWebKit/537.36 (KHTML, like Gecko) Chrome/155.0.0.0 Safari/537.36" "-"</w:t>
               <w:br/>
-              <w:t>172.17.0.1 - - [25/Oct/2026:08:38:38 +0000] "GET /style.css HTTP/1.1" 200 8256 "http://localhost:8034/" "Mozilla/5.0 (Windows NT 10.0; Win64; x64) AppleWebKit/537.36 (KHTML, like Gecko) Chrome/155.0.0.0 Safari/537.36" "-"</w:t>
+              <w:t>172.17.0.1 - - [25/Oct/2026:09:19:32 +0000] "GET /style.css HTTP/1.1" 304 0 "http://localhost:8034/" "Mozilla/5.0 (Windows NT 10.0; Win64; x64) AppleWebKit/537.36 (KHTML, like Gecko) Chrome/155.0.0.0 Safari/537.36" "-"</w:t>
               <w:br/>
-              <w:t>172.17.0.1 - - [25/Oct/2026:08:38:39 +0000] "GET /favicon.ico HTTP/1.1" 404 555 "http://localhost:8034/" "Mozilla/5.0 (Windows NT 10.0; Win64; x64) AppleWebKit/537.36 (KHTML, like Gecko) Chrome/155.0.0.0 Safari/537.36" "-"</w:t>
+              <w:t>172.17.0.1 - - [25/Oct/2026:09:19:34 +0000] "GET / HTTP/1.1" 304 0 "-" "Mozilla/5.0 (Windows NT 10.0; Win64; x64) AppleWebKit/537.36 (KHTML, like Gecko) Chrome/155.0.0.0 Safari/537.36" "-"</w:t>
               <w:br/>
-              <w:t>172.17.0.1 - - [25/Oct/2026:08:44:48 +0000] "GET / HTTP/1.1" 200 7903 "-" "Mozilla/5.0 (Windows NT; Windows NT 10.0; en-US) WindowsPowerShell/5.1.26100.9711" "-"</w:t>
+              <w:t>172.17.0.1 - - [25/Oct/2026:09:19:35 +0000] "GET / HTTP/1.1" 304 0 "-" "Mozilla/5.0 (Windows NT 10.0; Win64; x64) AppleWebKit/537.36 (KHTML, like Gecko) Chrome/155.0.0.0 Safari/537.36" "-"</w:t>
               <w:br/>
-              <w:t>172.17.0.1 - - [25/Oct/2026:08:44:48 +0000] "GET / HTTP/1.1" 200 7903 "-" "Mozilla/5.0 (Windows NT; Windows NT 10.0; en-US) WindowsPowerShell/5.1.26100.9711" "-"</w:t>
+              <w:t>172.17.0.1 - - [25/Oct/2026:09:19:37 +0000] "GET / HTTP/1.1" 304 0 "-" "Mozilla/5.0 (Windows NT 10.0; Win64; x64) AppleWebKit/537.36 (KHTML, like Gecko) Chrome/155.0.0.0 Safari/537.36" "-"</w:t>
               <w:br/>
-              <w:t>172.17.0.1 - - [25/Oct/2026:08:44:48 +0000] "GET / HTTP/1.1" 200 7903 "-" "Mozilla/5.0 (Windows NT; Windows NT 10.0; en-US) WindowsPowerShell/5.1.26100.9711" "-"</w:t>
+              <w:t>172.17.0.1 - - [25/Oct/2026:09:19:38 +0000] "GET / HTTP/1.1" 304 0 "-" "Mozilla/5.0 (Windows NT 10.0; Win64; x64) AppleWebKit/537.36 (KHTML, like Gecko) Chrome/155.0.0.0 Safari/537.36" "-"</w:t>
               <w:br/>
-              <w:t>172.17.0.1 - - [25/Oct/2026:08:44:48 +0000] "GET / HTTP/1.1" 200 7903 "-" "Mozilla/5.0 (Windows NT; Windows NT 10.0; en-US) WindowsPowerShell/5.1.26100.9711" "-"</w:t>
+              <w:t>172.17.0.1 - - [25/Oct/2026:09:19:38 +0000] "GET / HTTP/1.1" 304 0 "-" "Mozilla/5.0 (Windows NT 10.0; Win64; x64) AppleWebKit/537.36 (KHTML, like Gecko) Chrome/155.0.0.0 Safari/537.36" "-"</w:t>
               <w:br/>
-              <w:t>172.17.0.1 - - [25/Oct/2026:08:44:48 +0000] "GET / HTTP/1.1" 200 7903 "-" "Mozilla/5.0 (Windows NT; Windows NT 10.0; en-US) WindowsPowerShell/5.1.26100.9711" "-"</w:t>
+              <w:t>172.17.0.1 - - [25/Oct/2026:09:26:06 +0000] "GET / HTTP/1.1" 200 7903 "-" "Mozilla/5.0 (Windows NT; Windows NT 10.0; en-US) WindowsPowerShell/5.1.26100.9711" "-"</w:t>
               <w:br/>
-              <w:t>172.17.0.1 - - [25/Oct/2026:08:44:48 +0000] "GET / HTTP/1.1" 200 7903 "-" "Mozilla/5.0 (Windows NT; Windows NT 10.0; en-US) WindowsPowerShell/5.1.26100.9711" "-"</w:t>
+              <w:t>172.17.0.1 - - [25/Oct/2026:09:26:06 +0000] "GET / HTTP/1.1" 200 7903 "-" "Mozilla/5.0 (Windows NT; Windows NT 10.0; en-US) WindowsPowerShell/5.1.26100.9711" "-"</w:t>
               <w:br/>
-              <w:t>172.17.0.1 - - [25/Oct/2026:08:44:48 +0000] "GET / HTTP/1.1" 200 7903 "-" "Mozilla/5.0 (Windows NT; Windows NT 10.0; en-US) WindowsPowerShell/5.1.26100.9711" "-"</w:t>
+              <w:t>172.17.0.1 - - [25/Oct/2026:09:26:06 +0000] "GET / HTTP/1.1" 200 7903 "-" "Mozilla/5.0 (Windows NT; Windows NT 10.0; en-US) WindowsPowerShell/5.1.26100.9711" "-"</w:t>
               <w:br/>
-              <w:t>172.17.0.1 - - [25/Oct/2026:08:44:48 +0000] "GET / HTTP/1.1" 200 7903 "-" "Mozilla/5.0 (Windows NT; Windows NT 10.0; en-US) WindowsPowerShell/5.1.26100.9711" "-"</w:t>
+              <w:t>172.17.0.1 - - [25/Oct/2026:09:26:06 +0000] "GET / HTTP/1.1" 200 7903 "-" "Mozilla/5.0 (Windows NT; Windows NT 10.0; en-US) WindowsPowerShell/5.1.26100.9711" "-"</w:t>
               <w:br/>
-              <w:t>172.17.0.1 - - [25/Oct/2026:08:44:48 +0000] "GET / HTTP/1.1" 200 7903 "-" "Mozilla/5.0 (Windows NT; Windows NT 10.0; en-US) WindowsPowerShell/5.1.26100.9711" "-"</w:t>
+              <w:t>172.17.0.1 - - [25/Oct/2026:09:26:06 +0000] "GET / HTTP/1.1" 200 7903 "-" "Mozilla/5.0 (Windows NT; Windows NT 10.0; en-US) WindowsPowerShell/5.1.26100.9711" "-"</w:t>
               <w:br/>
-              <w:t>172.17.0.1 - - [25/Oct/2026:08:44:48 +0000] "GET / HTTP/1.1" 200 7903 "-" "Mozilla/5.0 (Windows NT; Windows NT 10.0; en-US) WindowsPowerShell/5.1.26100.9711" "-"</w:t>
+              <w:t>172.17.0.1 - - [25/Oct/2026:09:26:06 +0000] "GET / HTTP/1.1" 200 7903 "-" "Mozilla/5.0 (Windows NT; Windows NT 10.0; en-US) WindowsPowerShell/5.1.26100.9711" "-"</w:t>
+              <w:br/>
+              <w:t>172.17.0.1 - - [25/Oct/2026:09:26:06 +0000] "GET / HTTP/1.1" 200 7903 "-" "Mozilla/5.0 (Windows NT; Windows NT 10.0; en-US) WindowsPowerShell/5.1.26100.9711" "-"</w:t>
+              <w:br/>
+              <w:t>172.17.0.1 - - [25/Oct/2026:09:26:06 +0000] "GET / HTTP/1.1" 200 7903 "-" "Mozilla/5.0 (Windows NT; Windows NT 10.0; en-US) WindowsPowerShell/5.1.26100.9711" "-"</w:t>
             </w:r>
           </w:p>
         </w:tc>
@@ -2091,7 +2066,7 @@
           <w:color w:val="0F172A"/>
           <w:sz w:val="21"/>
         </w:rPr>
-        <w:t xml:space="preserve">• [25/Oct/2026:08:38:38 +0000]: </w:t>
+        <w:t xml:space="preserve">• [25/Oct/2026:09:19:32 +0000]: </w:t>
       </w:r>
       <w:r>
         <w:rPr>
@@ -2135,7 +2110,7 @@
           <w:color w:val="0F172A"/>
           <w:sz w:val="21"/>
         </w:rPr>
-        <w:t xml:space="preserve">• 200: </w:t>
+        <w:t xml:space="preserve">• 200 / 304: </w:t>
       </w:r>
       <w:r>
         <w:rPr>
@@ -2143,7 +2118,7 @@
           <w:color w:val="1E293B"/>
           <w:sz w:val="21"/>
         </w:rPr>
-        <w:t>HTTP Status Code បញ្ជាក់ថា Web Server ឆ្លើយតបបានជោគជ័យ (200 OK)។</w:t>
+        <w:t>HTTP Status Code បញ្ជាក់ពីការឆ្លើយតបរបស់ Server (200 OK ជោគជ័យ, 304 Not Modified ប្រើប្រាស់ Cache Browser)។</w:t>
       </w:r>
     </w:p>
     <w:p>
@@ -3049,7 +3024,7 @@
           <w:color w:val="1E293B"/>
           <w:sz w:val="21"/>
         </w:rPr>
-        <w:t>ឯកសារ Server Access Logs ដែលទាញចេញពី Nginx Container ផ្ទុកកំណត់ត្រាលើសពី ១០ ដង (ជាក់ស្តែង ១៣ ដង)។</w:t>
+        <w:t>ឯកសារ Server Access Logs ដែលទាញចេញពី Nginx Container ផ្ទុកកំណត់ត្រាលើសពី ១០ ដង (ជាក់ស្តែង ១៥ ដង)។</w:t>
       </w:r>
     </w:p>
     <w:p>

</xml_diff>